<commit_message>
Present public curriculum as SVG maps and correct Academy document branding
</commit_message>
<xml_diff>
--- a/downloads/mini-quiz-curriculum-v1.docx
+++ b/downloads/mini-quiz-curriculum-v1.docx
@@ -7,7 +7,7 @@
         <w:pStyle w:val="Title"/>
       </w:pPr>
       <w:r>
-        <w:t>Mini Quiz AI-cademy Curriculum</w:t>
+        <w:t>Mini Quiz Tech &amp; AI Academy</w:t>
       </w:r>
     </w:p>
     <w:p>
@@ -22645,7 +22645,7 @@
         <w:color w:val="000000"/>
         <w:sz w:val="16"/>
       </w:rPr>
-      <w:t>MINI QUIZ AI-CADEMY  |  CURRICULUM</w:t>
+      <w:t>MINI QUIZ TECH &amp; AI ACADEMY  |  CURRICULUM</w:t>
     </w:r>
   </w:p>
 </w:hdr>

</xml_diff>